<commit_message>
kill me out of this
</commit_message>
<xml_diff>
--- a/6 семестр/ППцП/ПЗ.docx
+++ b/6 семестр/ППцП/ПЗ.docx
@@ -1,6 +1,6 @@
 
 <file path=word/document.xml><?xml version="1.0" encoding="utf-8"?>
-<w:document xmlns:wpc="http://schemas.microsoft.com/office/word/2010/wordprocessingCanvas" xmlns:cx="http://schemas.microsoft.com/office/drawing/2014/chartex" xmlns:cx1="http://schemas.microsoft.com/office/drawing/2015/9/8/chartex" xmlns:cx2="http://schemas.microsoft.com/office/drawing/2015/10/21/chartex" xmlns:cx3="http://schemas.microsoft.com/office/drawing/2016/5/9/chartex" xmlns:cx4="http://schemas.microsoft.com/office/drawing/2016/5/10/chartex" xmlns:cx5="http://schemas.microsoft.com/office/drawing/2016/5/11/chartex" xmlns:cx6="http://schemas.microsoft.com/office/drawing/2016/5/12/chartex" xmlns:cx7="http://schemas.microsoft.com/office/drawing/2016/5/13/chartex" xmlns:cx8="http://schemas.microsoft.com/office/drawing/2016/5/14/chartex" xmlns:mc="http://schemas.openxmlformats.org/markup-compatibility/2006" xmlns:aink="http://schemas.microsoft.com/office/drawing/2016/ink" xmlns:am3d="http://schemas.microsoft.com/office/drawing/2017/model3d" xmlns:o="urn:schemas-microsoft-com:office:office" xmlns:oel="http://schemas.microsoft.com/office/2019/extlst" xmlns:r="http://schemas.openxmlformats.org/officeDocument/2006/relationships" xmlns:m="http://schemas.openxmlformats.org/officeDocument/2006/math" xmlns:v="urn:schemas-microsoft-com:vml" xmlns:wp14="http://schemas.microsoft.com/office/word/2010/wordprocessingDrawing" xmlns:wp="http://schemas.openxmlformats.org/drawingml/2006/wordprocessingDrawing" xmlns:w10="urn:schemas-microsoft-com:office:word" xmlns:w="http://schemas.openxmlformats.org/wordprocessingml/2006/main" xmlns:w14="http://schemas.microsoft.com/office/word/2010/wordml" xmlns:w15="http://schemas.microsoft.com/office/word/2012/wordml" xmlns:w16cex="http://schemas.microsoft.com/office/word/2018/wordml/cex" xmlns:w16cid="http://schemas.microsoft.com/office/word/2016/wordml/cid" xmlns:w16="http://schemas.microsoft.com/office/word/2018/wordml" xmlns:w16du="http://schemas.microsoft.com/office/word/2023/wordml/word16du" xmlns:w16sdtdh="http://schemas.microsoft.com/office/word/2020/wordml/sdtdatahash" xmlns:w16se="http://schemas.microsoft.com/office/word/2015/wordml/symex" xmlns:wpg="http://schemas.microsoft.com/office/word/2010/wordprocessingGroup" xmlns:wpi="http://schemas.microsoft.com/office/word/2010/wordprocessingInk" xmlns:wne="http://schemas.microsoft.com/office/word/2006/wordml" xmlns:wps="http://schemas.microsoft.com/office/word/2010/wordprocessingShape" mc:Ignorable="w14 w15 w16se w16cid w16 w16cex w16sdtdh w16du wp14">
+<w:document xmlns:wpc="http://schemas.microsoft.com/office/word/2010/wordprocessingCanvas" xmlns:cx="http://schemas.microsoft.com/office/drawing/2014/chartex" xmlns:cx1="http://schemas.microsoft.com/office/drawing/2015/9/8/chartex" xmlns:cx2="http://schemas.microsoft.com/office/drawing/2015/10/21/chartex" xmlns:cx3="http://schemas.microsoft.com/office/drawing/2016/5/9/chartex" xmlns:cx4="http://schemas.microsoft.com/office/drawing/2016/5/10/chartex" xmlns:cx5="http://schemas.microsoft.com/office/drawing/2016/5/11/chartex" xmlns:cx6="http://schemas.microsoft.com/office/drawing/2016/5/12/chartex" xmlns:cx7="http://schemas.microsoft.com/office/drawing/2016/5/13/chartex" xmlns:cx8="http://schemas.microsoft.com/office/drawing/2016/5/14/chartex" xmlns:mc="http://schemas.openxmlformats.org/markup-compatibility/2006" xmlns:aink="http://schemas.microsoft.com/office/drawing/2016/ink" xmlns:am3d="http://schemas.microsoft.com/office/drawing/2017/model3d" xmlns:o="urn:schemas-microsoft-com:office:office" xmlns:oel="http://schemas.microsoft.com/office/2019/extlst" xmlns:r="http://schemas.openxmlformats.org/officeDocument/2006/relationships" xmlns:m="http://schemas.openxmlformats.org/officeDocument/2006/math" xmlns:v="urn:schemas-microsoft-com:vml" xmlns:wp14="http://schemas.microsoft.com/office/word/2010/wordprocessingDrawing" xmlns:wp="http://schemas.openxmlformats.org/drawingml/2006/wordprocessingDrawing" xmlns:w10="urn:schemas-microsoft-com:office:word" xmlns:w="http://schemas.openxmlformats.org/wordprocessingml/2006/main" xmlns:w14="http://schemas.microsoft.com/office/word/2010/wordml" xmlns:w15="http://schemas.microsoft.com/office/word/2012/wordml" xmlns:w16cex="http://schemas.microsoft.com/office/word/2018/wordml/cex" xmlns:w16cid="http://schemas.microsoft.com/office/word/2016/wordml/cid" xmlns:w16="http://schemas.microsoft.com/office/word/2018/wordml" xmlns:w16du="http://schemas.microsoft.com/office/word/2023/wordml/word16du" xmlns:w16sdtdh="http://schemas.microsoft.com/office/word/2020/wordml/sdtdatahash" xmlns:w16sdtfl="http://schemas.microsoft.com/office/word/2024/wordml/sdtformatlock" xmlns:w16se="http://schemas.microsoft.com/office/word/2015/wordml/symex" xmlns:wpg="http://schemas.microsoft.com/office/word/2010/wordprocessingGroup" xmlns:wpi="http://schemas.microsoft.com/office/word/2010/wordprocessingInk" xmlns:wne="http://schemas.microsoft.com/office/word/2006/wordml" xmlns:wps="http://schemas.microsoft.com/office/word/2010/wordprocessingShape" mc:Ignorable="w14 w15 w16se w16cid w16 w16cex w16sdtdh w16sdtfl w16du wp14">
   <w:body>
     <w:tbl>
       <w:tblPr>
@@ -2676,7 +2676,23 @@
         <w:t xml:space="preserve">Системы распознавания автомобильных номеров состоят из двух модулей: детектор (обнаружение номера на фото) и распознаватель символов </w:t>
       </w:r>
       <w:r>
-        <w:t>(Optical Character Recognition, OCR)</w:t>
+        <w:t xml:space="preserve">(Optical </w:t>
+      </w:r>
+      <w:proofErr w:type="spellStart"/>
+      <w:r>
+        <w:t>Character</w:t>
+      </w:r>
+      <w:proofErr w:type="spellEnd"/>
+      <w:r>
+        <w:t xml:space="preserve"> </w:t>
+      </w:r>
+      <w:proofErr w:type="spellStart"/>
+      <w:r>
+        <w:t>Recognition</w:t>
+      </w:r>
+      <w:proofErr w:type="spellEnd"/>
+      <w:r>
+        <w:t>, OCR)</w:t>
       </w:r>
       <w:r>
         <w:t>. В рамках данной работы будем считать, что детектор реализован заранее, все фотографии номеров берутся в обрезанном виде.</w:t>
@@ -2761,7 +2777,31 @@
         <w:t>CCPD</w:t>
       </w:r>
       <w:r>
-        <w:t xml:space="preserve">2019 (Chinese City Parking Dataset). </w:t>
+        <w:t>2019 (</w:t>
+      </w:r>
+      <w:proofErr w:type="spellStart"/>
+      <w:r>
+        <w:t>Chinese</w:t>
+      </w:r>
+      <w:proofErr w:type="spellEnd"/>
+      <w:r>
+        <w:t xml:space="preserve"> City </w:t>
+      </w:r>
+      <w:proofErr w:type="spellStart"/>
+      <w:r>
+        <w:t>Parking</w:t>
+      </w:r>
+      <w:proofErr w:type="spellEnd"/>
+      <w:r>
+        <w:t xml:space="preserve"> </w:t>
+      </w:r>
+      <w:proofErr w:type="spellStart"/>
+      <w:r>
+        <w:t>Dataset</w:t>
+      </w:r>
+      <w:proofErr w:type="spellEnd"/>
+      <w:r>
+        <w:t xml:space="preserve">). </w:t>
       </w:r>
       <w:r>
         <w:t>В нём содержится около 300 тысяч изображений китайских номерных знаков при различных условиях.</w:t>
@@ -2854,8 +2894,13 @@
         <w:t xml:space="preserve">тестирования обученной нейросети. Изображений 9999 штук, все они взяты из подмножества </w:t>
       </w:r>
       <w:r>
-        <w:t>CCPD-weather</w:t>
-      </w:r>
+        <w:t>CCPD-</w:t>
+      </w:r>
+      <w:proofErr w:type="spellStart"/>
+      <w:r>
+        <w:t>weather</w:t>
+      </w:r>
+      <w:proofErr w:type="spellEnd"/>
       <w:r>
         <w:t xml:space="preserve"> (фотографии в плохих погодных условиях).</w:t>
       </w:r>
@@ -3385,7 +3430,31 @@
     </w:p>
     <w:p>
       <w:r>
-        <w:t>Для извлечения признаков из изображений используется последовательность из нескольких свёрточных блоков (CNNBlock). Эти блоки включают два свёрточных слоя, батч-нормализацию и активацию ReLU.</w:t>
+        <w:t>Для извлечения признаков из изображений используется последовательность из нескольких свёрточных блоков (</w:t>
+      </w:r>
+      <w:proofErr w:type="spellStart"/>
+      <w:r>
+        <w:t>CNNBlock</w:t>
+      </w:r>
+      <w:proofErr w:type="spellEnd"/>
+      <w:r>
+        <w:t xml:space="preserve">). Эти блоки включают два свёрточных слоя, </w:t>
+      </w:r>
+      <w:proofErr w:type="spellStart"/>
+      <w:r>
+        <w:t>батч</w:t>
+      </w:r>
+      <w:proofErr w:type="spellEnd"/>
+      <w:r>
+        <w:t xml:space="preserve">-нормализацию и активацию </w:t>
+      </w:r>
+      <w:proofErr w:type="spellStart"/>
+      <w:r>
+        <w:t>ReLU</w:t>
+      </w:r>
+      <w:proofErr w:type="spellEnd"/>
+      <w:r>
+        <w:t>.</w:t>
       </w:r>
     </w:p>
     <w:p>
@@ -3859,7 +3928,15 @@
         <w:t xml:space="preserve">LSTM </w:t>
       </w:r>
       <w:r>
-        <w:t>(Long Short-Term Memory)</w:t>
+        <w:t xml:space="preserve">(Long </w:t>
+      </w:r>
+      <w:proofErr w:type="spellStart"/>
+      <w:r>
+        <w:t>Short-Term</w:t>
+      </w:r>
+      <w:proofErr w:type="spellEnd"/>
+      <w:r>
+        <w:t xml:space="preserve"> Memory)</w:t>
       </w:r>
       <w:r>
         <w:t xml:space="preserve"> </w:t>
@@ -4115,7 +4192,15 @@
         <w:t>CTC</w:t>
       </w:r>
       <w:r>
-        <w:t>, необходимо применить к ним активацию softmax и затем взять логарифм</w:t>
+        <w:t xml:space="preserve">, необходимо применить к ним активацию </w:t>
+      </w:r>
+      <w:proofErr w:type="spellStart"/>
+      <w:r>
+        <w:t>softmax</w:t>
+      </w:r>
+      <w:proofErr w:type="spellEnd"/>
+      <w:r>
+        <w:t xml:space="preserve"> и затем взять логарифм</w:t>
       </w:r>
       <w:r>
         <w:t>:</w:t>
@@ -5292,7 +5377,23 @@
         <w:t xml:space="preserve">потери, </w:t>
       </w:r>
       <w:r>
-        <w:t>точность, Character Error Rate (CER) и расстояние Левенштейна.</w:t>
+        <w:t xml:space="preserve">точность, </w:t>
+      </w:r>
+      <w:proofErr w:type="spellStart"/>
+      <w:r>
+        <w:t>Character</w:t>
+      </w:r>
+      <w:proofErr w:type="spellEnd"/>
+      <w:r>
+        <w:t xml:space="preserve"> </w:t>
+      </w:r>
+      <w:proofErr w:type="spellStart"/>
+      <w:r>
+        <w:t>Error</w:t>
+      </w:r>
+      <w:proofErr w:type="spellEnd"/>
+      <w:r>
+        <w:t xml:space="preserve"> Rate (CER) и расстояние Левенштейна.</w:t>
       </w:r>
     </w:p>
     <w:p>
@@ -5417,11 +5518,33 @@
       </w:r>
     </w:p>
     <w:p>
+      <w:proofErr w:type="spellStart"/>
       <w:r>
         <w:rPr>
           <w:u w:val="single"/>
         </w:rPr>
-        <w:t>Character Error Rate (CER)</w:t>
+        <w:t>Character</w:t>
+      </w:r>
+      <w:proofErr w:type="spellEnd"/>
+      <w:r>
+        <w:rPr>
+          <w:u w:val="single"/>
+        </w:rPr>
+        <w:t xml:space="preserve"> </w:t>
+      </w:r>
+      <w:proofErr w:type="spellStart"/>
+      <w:r>
+        <w:rPr>
+          <w:u w:val="single"/>
+        </w:rPr>
+        <w:t>Error</w:t>
+      </w:r>
+      <w:proofErr w:type="spellEnd"/>
+      <w:r>
+        <w:rPr>
+          <w:u w:val="single"/>
+        </w:rPr>
+        <w:t xml:space="preserve"> Rate (CER)</w:t>
       </w:r>
       <w:r>
         <w:t xml:space="preserve"> – это доля неправильно предсказанных символов к общему количеству символов. Эта метрика показывает, насколько точно модель распознает отдельные символы, из которых состоят номера.</w:t>
@@ -6143,8 +6266,37 @@
         </w:tabs>
         <w:ind w:left="0" w:firstLine="709"/>
       </w:pPr>
-      <w:r>
-        <w:t>Анирад К., Сиддха Г., Мехер К. Искусственный интеллект и компьютерное зрение. Реальные проекты на Python, Keras и TensorFlow. — СПб.: Питер, 2023 — 624 с.</w:t>
+      <w:proofErr w:type="spellStart"/>
+      <w:r>
+        <w:t>Анирад</w:t>
+      </w:r>
+      <w:proofErr w:type="spellEnd"/>
+      <w:r>
+        <w:t xml:space="preserve"> К., Сиддха Г., </w:t>
+      </w:r>
+      <w:proofErr w:type="spellStart"/>
+      <w:r>
+        <w:t>Мехер</w:t>
+      </w:r>
+      <w:proofErr w:type="spellEnd"/>
+      <w:r>
+        <w:t xml:space="preserve"> К. Искусственный интеллект и компьютерное зрение. Реальные проекты на Python, </w:t>
+      </w:r>
+      <w:proofErr w:type="spellStart"/>
+      <w:r>
+        <w:t>Keras</w:t>
+      </w:r>
+      <w:proofErr w:type="spellEnd"/>
+      <w:r>
+        <w:t xml:space="preserve"> и </w:t>
+      </w:r>
+      <w:proofErr w:type="spellStart"/>
+      <w:r>
+        <w:t>TensorFlow</w:t>
+      </w:r>
+      <w:proofErr w:type="spellEnd"/>
+      <w:r>
+        <w:t>. — СПб.: Питер, 2023 — 624 с.</w:t>
       </w:r>
     </w:p>
     <w:p>
@@ -6177,99 +6329,75 @@
       <w:r>
         <w:t xml:space="preserve">, 29.05.2017, </w:t>
       </w:r>
-      <w:hyperlink r:id="rId12" w:history="1">
-        <w:r>
-          <w:rPr>
-            <w:rStyle w:val="a6"/>
-            <w:lang w:val="en-US"/>
-          </w:rPr>
-          <w:t>https</w:t>
-        </w:r>
-        <w:r>
-          <w:rPr>
-            <w:rStyle w:val="a6"/>
-          </w:rPr>
-          <w:t>://</w:t>
-        </w:r>
-        <w:r>
-          <w:rPr>
-            <w:rStyle w:val="a6"/>
-            <w:lang w:val="en-US"/>
-          </w:rPr>
-          <w:t>habr</w:t>
-        </w:r>
-        <w:r>
-          <w:rPr>
-            <w:rStyle w:val="a6"/>
-          </w:rPr>
-          <w:t>.</w:t>
-        </w:r>
-        <w:r>
-          <w:rPr>
-            <w:rStyle w:val="a6"/>
-            <w:lang w:val="en-US"/>
-          </w:rPr>
-          <w:t>com</w:t>
-        </w:r>
-        <w:r>
-          <w:rPr>
-            <w:rStyle w:val="a6"/>
-          </w:rPr>
-          <w:t>/</w:t>
-        </w:r>
-        <w:r>
-          <w:rPr>
-            <w:rStyle w:val="a6"/>
-            <w:lang w:val="en-US"/>
-          </w:rPr>
-          <w:t>ru</w:t>
-        </w:r>
-        <w:r>
-          <w:rPr>
-            <w:rStyle w:val="a6"/>
-          </w:rPr>
-          <w:t>/</w:t>
-        </w:r>
-        <w:r>
-          <w:rPr>
-            <w:rStyle w:val="a6"/>
-            <w:lang w:val="en-US"/>
-          </w:rPr>
-          <w:t>companies</w:t>
-        </w:r>
-        <w:r>
-          <w:rPr>
-            <w:rStyle w:val="a6"/>
-          </w:rPr>
-          <w:t>/</w:t>
-        </w:r>
-        <w:r>
-          <w:rPr>
-            <w:rStyle w:val="a6"/>
-            <w:lang w:val="en-US"/>
-          </w:rPr>
-          <w:t>recognitor</w:t>
-        </w:r>
-        <w:r>
-          <w:rPr>
-            <w:rStyle w:val="a6"/>
-          </w:rPr>
-          <w:t>/</w:t>
-        </w:r>
-        <w:r>
-          <w:rPr>
-            <w:rStyle w:val="a6"/>
-            <w:lang w:val="en-US"/>
-          </w:rPr>
-          <w:t>articles</w:t>
-        </w:r>
-        <w:r>
-          <w:rPr>
-            <w:rStyle w:val="a6"/>
-          </w:rPr>
-          <w:t>/329636/</w:t>
-        </w:r>
-      </w:hyperlink>
+      <w:r>
+        <w:rPr>
+          <w:lang w:val="en-US"/>
+        </w:rPr>
+        <w:t>https</w:t>
+      </w:r>
+      <w:r>
+        <w:t>://</w:t>
+      </w:r>
+      <w:proofErr w:type="spellStart"/>
+      <w:r>
+        <w:rPr>
+          <w:lang w:val="en-US"/>
+        </w:rPr>
+        <w:t>habr</w:t>
+      </w:r>
+      <w:proofErr w:type="spellEnd"/>
+      <w:r>
+        <w:t>.</w:t>
+      </w:r>
+      <w:r>
+        <w:rPr>
+          <w:lang w:val="en-US"/>
+        </w:rPr>
+        <w:t>com</w:t>
+      </w:r>
+      <w:r>
+        <w:t>/</w:t>
+      </w:r>
+      <w:proofErr w:type="spellStart"/>
+      <w:r>
+        <w:rPr>
+          <w:lang w:val="en-US"/>
+        </w:rPr>
+        <w:t>ru</w:t>
+      </w:r>
+      <w:proofErr w:type="spellEnd"/>
+      <w:r>
+        <w:t>/</w:t>
+      </w:r>
+      <w:r>
+        <w:rPr>
+          <w:lang w:val="en-US"/>
+        </w:rPr>
+        <w:t>companies</w:t>
+      </w:r>
+      <w:r>
+        <w:t>/</w:t>
+      </w:r>
+      <w:proofErr w:type="spellStart"/>
+      <w:r>
+        <w:rPr>
+          <w:lang w:val="en-US"/>
+        </w:rPr>
+        <w:t>recognitor</w:t>
+      </w:r>
+      <w:proofErr w:type="spellEnd"/>
+      <w:r>
+        <w:t>/</w:t>
+      </w:r>
+      <w:r>
+        <w:rPr>
+          <w:lang w:val="en-US"/>
+        </w:rPr>
+        <w:t>articles</w:t>
+      </w:r>
+      <w:r>
+        <w:t>/329636/</w:t>
+      </w:r>
       <w:r>
         <w:t xml:space="preserve"> [</w:t>
       </w:r>
@@ -6299,7 +6427,21 @@
         <w:rPr>
           <w:lang w:val="en-US"/>
         </w:rPr>
-        <w:t>Shi B., Bai X., Yao C. (2015). An End-to-End Trainable Neural Network for Image-based Sequence Recognition and Its Application to Scene Text Recognition. arXiv: 1507.05717</w:t>
+        <w:t xml:space="preserve">Shi B., Bai X., Yao C. (2015). An End-to-End Trainable Neural Network for Image-based Sequence Recognition and Its Application to Scene Text Recognition. </w:t>
+      </w:r>
+      <w:proofErr w:type="spellStart"/>
+      <w:r>
+        <w:rPr>
+          <w:lang w:val="en-US"/>
+        </w:rPr>
+        <w:t>arXiv</w:t>
+      </w:r>
+      <w:proofErr w:type="spellEnd"/>
+      <w:r>
+        <w:rPr>
+          <w:lang w:val="en-US"/>
+        </w:rPr>
+        <w:t>: 1507.05717</w:t>
       </w:r>
       <w:r>
         <w:rPr>
@@ -6323,14 +6465,47 @@
           <w:lang w:val="en-US"/>
         </w:rPr>
       </w:pPr>
-      <w:r>
-        <w:t xml:space="preserve">Клетте Р. Компьютерное зрение. Теория и алгоритмы / пер. с англ. </w:t>
+      <w:proofErr w:type="spellStart"/>
+      <w:r>
+        <w:t>Клетте</w:t>
+      </w:r>
+      <w:proofErr w:type="spellEnd"/>
+      <w:r>
+        <w:t xml:space="preserve"> Р. Компьютерное зрение. Теория и алгоритмы / пер. с англ. </w:t>
       </w:r>
       <w:r>
         <w:rPr>
           <w:lang w:val="en-US"/>
         </w:rPr>
-        <w:t>А. А. Слинкин. – М.: ДМК Пресс, 2019. – 506 с.</w:t>
+        <w:t xml:space="preserve">А. А. </w:t>
+      </w:r>
+      <w:proofErr w:type="spellStart"/>
+      <w:r>
+        <w:rPr>
+          <w:lang w:val="en-US"/>
+        </w:rPr>
+        <w:t>Слинкин</w:t>
+      </w:r>
+      <w:proofErr w:type="spellEnd"/>
+      <w:r>
+        <w:rPr>
+          <w:lang w:val="en-US"/>
+        </w:rPr>
+        <w:t xml:space="preserve">. – М.: ДМК </w:t>
+      </w:r>
+      <w:proofErr w:type="spellStart"/>
+      <w:r>
+        <w:rPr>
+          <w:lang w:val="en-US"/>
+        </w:rPr>
+        <w:t>Пресс</w:t>
+      </w:r>
+      <w:proofErr w:type="spellEnd"/>
+      <w:r>
+        <w:rPr>
+          <w:lang w:val="en-US"/>
+        </w:rPr>
+        <w:t>, 2019. – 506 с.</w:t>
       </w:r>
     </w:p>
     <w:p>
@@ -6369,7 +6544,7 @@
 </file>
 
 <file path=word/numbering.xml><?xml version="1.0" encoding="utf-8"?>
-<w:numbering xmlns:wpc="http://schemas.microsoft.com/office/word/2010/wordprocessingCanvas" xmlns:cx="http://schemas.microsoft.com/office/drawing/2014/chartex" xmlns:cx1="http://schemas.microsoft.com/office/drawing/2015/9/8/chartex" xmlns:cx2="http://schemas.microsoft.com/office/drawing/2015/10/21/chartex" xmlns:cx3="http://schemas.microsoft.com/office/drawing/2016/5/9/chartex" xmlns:cx4="http://schemas.microsoft.com/office/drawing/2016/5/10/chartex" xmlns:cx5="http://schemas.microsoft.com/office/drawing/2016/5/11/chartex" xmlns:cx6="http://schemas.microsoft.com/office/drawing/2016/5/12/chartex" xmlns:cx7="http://schemas.microsoft.com/office/drawing/2016/5/13/chartex" xmlns:cx8="http://schemas.microsoft.com/office/drawing/2016/5/14/chartex" xmlns:mc="http://schemas.openxmlformats.org/markup-compatibility/2006" xmlns:aink="http://schemas.microsoft.com/office/drawing/2016/ink" xmlns:am3d="http://schemas.microsoft.com/office/drawing/2017/model3d" xmlns:o="urn:schemas-microsoft-com:office:office" xmlns:oel="http://schemas.microsoft.com/office/2019/extlst" xmlns:r="http://schemas.openxmlformats.org/officeDocument/2006/relationships" xmlns:m="http://schemas.openxmlformats.org/officeDocument/2006/math" xmlns:v="urn:schemas-microsoft-com:vml" xmlns:wp14="http://schemas.microsoft.com/office/word/2010/wordprocessingDrawing" xmlns:wp="http://schemas.openxmlformats.org/drawingml/2006/wordprocessingDrawing" xmlns:w10="urn:schemas-microsoft-com:office:word" xmlns:w="http://schemas.openxmlformats.org/wordprocessingml/2006/main" xmlns:w14="http://schemas.microsoft.com/office/word/2010/wordml" xmlns:w15="http://schemas.microsoft.com/office/word/2012/wordml" xmlns:w16cex="http://schemas.microsoft.com/office/word/2018/wordml/cex" xmlns:w16cid="http://schemas.microsoft.com/office/word/2016/wordml/cid" xmlns:w16="http://schemas.microsoft.com/office/word/2018/wordml" xmlns:w16du="http://schemas.microsoft.com/office/word/2023/wordml/word16du" xmlns:w16sdtdh="http://schemas.microsoft.com/office/word/2020/wordml/sdtdatahash" xmlns:w16se="http://schemas.microsoft.com/office/word/2015/wordml/symex" xmlns:wpg="http://schemas.microsoft.com/office/word/2010/wordprocessingGroup" xmlns:wpi="http://schemas.microsoft.com/office/word/2010/wordprocessingInk" xmlns:wne="http://schemas.microsoft.com/office/word/2006/wordml" xmlns:wps="http://schemas.microsoft.com/office/word/2010/wordprocessingShape" mc:Ignorable="w14 w15 w16se w16cid w16 w16cex w16sdtdh w16du wp14">
+<w:numbering xmlns:wpc="http://schemas.microsoft.com/office/word/2010/wordprocessingCanvas" xmlns:cx="http://schemas.microsoft.com/office/drawing/2014/chartex" xmlns:cx1="http://schemas.microsoft.com/office/drawing/2015/9/8/chartex" xmlns:cx2="http://schemas.microsoft.com/office/drawing/2015/10/21/chartex" xmlns:cx3="http://schemas.microsoft.com/office/drawing/2016/5/9/chartex" xmlns:cx4="http://schemas.microsoft.com/office/drawing/2016/5/10/chartex" xmlns:cx5="http://schemas.microsoft.com/office/drawing/2016/5/11/chartex" xmlns:cx6="http://schemas.microsoft.com/office/drawing/2016/5/12/chartex" xmlns:cx7="http://schemas.microsoft.com/office/drawing/2016/5/13/chartex" xmlns:cx8="http://schemas.microsoft.com/office/drawing/2016/5/14/chartex" xmlns:mc="http://schemas.openxmlformats.org/markup-compatibility/2006" xmlns:aink="http://schemas.microsoft.com/office/drawing/2016/ink" xmlns:am3d="http://schemas.microsoft.com/office/drawing/2017/model3d" xmlns:o="urn:schemas-microsoft-com:office:office" xmlns:oel="http://schemas.microsoft.com/office/2019/extlst" xmlns:r="http://schemas.openxmlformats.org/officeDocument/2006/relationships" xmlns:m="http://schemas.openxmlformats.org/officeDocument/2006/math" xmlns:v="urn:schemas-microsoft-com:vml" xmlns:wp14="http://schemas.microsoft.com/office/word/2010/wordprocessingDrawing" xmlns:wp="http://schemas.openxmlformats.org/drawingml/2006/wordprocessingDrawing" xmlns:w10="urn:schemas-microsoft-com:office:word" xmlns:w="http://schemas.openxmlformats.org/wordprocessingml/2006/main" xmlns:w14="http://schemas.microsoft.com/office/word/2010/wordml" xmlns:w15="http://schemas.microsoft.com/office/word/2012/wordml" xmlns:w16cex="http://schemas.microsoft.com/office/word/2018/wordml/cex" xmlns:w16cid="http://schemas.microsoft.com/office/word/2016/wordml/cid" xmlns:w16="http://schemas.microsoft.com/office/word/2018/wordml" xmlns:w16du="http://schemas.microsoft.com/office/word/2023/wordml/word16du" xmlns:w16sdtdh="http://schemas.microsoft.com/office/word/2020/wordml/sdtdatahash" xmlns:w16sdtfl="http://schemas.microsoft.com/office/word/2024/wordml/sdtformatlock" xmlns:w16se="http://schemas.microsoft.com/office/word/2015/wordml/symex" xmlns:wpg="http://schemas.microsoft.com/office/word/2010/wordprocessingGroup" xmlns:wpi="http://schemas.microsoft.com/office/word/2010/wordprocessingInk" xmlns:wne="http://schemas.microsoft.com/office/word/2006/wordml" xmlns:wps="http://schemas.microsoft.com/office/word/2010/wordprocessingShape" mc:Ignorable="w14 w15 w16se w16cid w16 w16cex w16sdtdh w16sdtfl w16du wp14">
   <w:abstractNum w:abstractNumId="0" w15:restartNumberingAfterBreak="0">
     <w:nsid w:val="042A6F54"/>
     <w:multiLevelType w:val="hybridMultilevel"/>
@@ -6963,7 +7138,7 @@
 </file>
 
 <file path=word/styles.xml><?xml version="1.0" encoding="utf-8"?>
-<w:styles xmlns:mc="http://schemas.openxmlformats.org/markup-compatibility/2006" xmlns:r="http://schemas.openxmlformats.org/officeDocument/2006/relationships" xmlns:w="http://schemas.openxmlformats.org/wordprocessingml/2006/main" xmlns:w14="http://schemas.microsoft.com/office/word/2010/wordml" xmlns:w15="http://schemas.microsoft.com/office/word/2012/wordml" xmlns:w16cex="http://schemas.microsoft.com/office/word/2018/wordml/cex" xmlns:w16cid="http://schemas.microsoft.com/office/word/2016/wordml/cid" xmlns:w16="http://schemas.microsoft.com/office/word/2018/wordml" xmlns:w16du="http://schemas.microsoft.com/office/word/2023/wordml/word16du" xmlns:w16sdtdh="http://schemas.microsoft.com/office/word/2020/wordml/sdtdatahash" xmlns:w16se="http://schemas.microsoft.com/office/word/2015/wordml/symex" mc:Ignorable="w14 w15 w16se w16cid w16 w16cex w16sdtdh w16du">
+<w:styles xmlns:mc="http://schemas.openxmlformats.org/markup-compatibility/2006" xmlns:r="http://schemas.openxmlformats.org/officeDocument/2006/relationships" xmlns:w="http://schemas.openxmlformats.org/wordprocessingml/2006/main" xmlns:w14="http://schemas.microsoft.com/office/word/2010/wordml" xmlns:w15="http://schemas.microsoft.com/office/word/2012/wordml" xmlns:w16cex="http://schemas.microsoft.com/office/word/2018/wordml/cex" xmlns:w16cid="http://schemas.microsoft.com/office/word/2016/wordml/cid" xmlns:w16="http://schemas.microsoft.com/office/word/2018/wordml" xmlns:w16du="http://schemas.microsoft.com/office/word/2023/wordml/word16du" xmlns:w16sdtdh="http://schemas.microsoft.com/office/word/2020/wordml/sdtdatahash" xmlns:w16sdtfl="http://schemas.microsoft.com/office/word/2024/wordml/sdtformatlock" xmlns:w16se="http://schemas.microsoft.com/office/word/2015/wordml/symex" mc:Ignorable="w14 w15 w16se w16cid w16 w16cex w16sdtdh w16sdtfl w16du">
   <w:docDefaults>
     <w:rPrDefault>
       <w:rPr>

</xml_diff>